<commit_message>
Apply production fixes: admin passphrase UI, rate-limit guard, patient/routes fixes, updated template
</commit_message>
<xml_diff>
--- a/public/templates/registration_template.docx
+++ b/public/templates/registration_template.docx
@@ -725,14 +725,7 @@
           <w:sz w:val="24"/>
           <w:szCs w:val="24"/>
         </w:rPr>
-        <w:t>}</w:t>
-      </w:r>
-      <w:r>
-        <w:rPr>
-          <w:sz w:val="24"/>
-          <w:szCs w:val="24"/>
-        </w:rPr>
-        <w:t xml:space="preserve"> </w:t>
+        <w:t xml:space="preserve">} </w:t>
       </w:r>
     </w:p>
     <w:p>
@@ -1394,136 +1387,6 @@
               <w:rPr>
                 <w:b/>
                 <w:bCs/>
-                <w:sz w:val="20"/>
-                <w:szCs w:val="20"/>
-              </w:rPr>
-              <w:t>Commune:</w:t>
-            </w:r>
-            <w:r>
-              <w:rPr>
-                <w:sz w:val="20"/>
-                <w:szCs w:val="20"/>
-              </w:rPr>
-              <w:t xml:space="preserve"> {commune}</w:t>
-            </w:r>
-          </w:p>
-        </w:tc>
-      </w:tr>
-      <w:tr>
-        <w:trPr>
-          <w:trHeight w:val="321"/>
-        </w:trPr>
-        <w:tc>
-          <w:tcPr>
-            <w:tcW w:w="3470" w:type="dxa"/>
-          </w:tcPr>
-          <w:p>
-            <w:pPr>
-              <w:rPr>
-                <w:sz w:val="20"/>
-                <w:szCs w:val="20"/>
-              </w:rPr>
-            </w:pPr>
-            <w:r>
-              <w:rPr>
-                <w:b/>
-                <w:bCs/>
-                <w:sz w:val="20"/>
-                <w:szCs w:val="20"/>
-              </w:rPr>
-              <w:t>Mobile Number:</w:t>
-            </w:r>
-            <w:r>
-              <w:rPr>
-                <w:sz w:val="20"/>
-                <w:szCs w:val="20"/>
-              </w:rPr>
-              <w:t xml:space="preserve"> {</w:t>
-            </w:r>
-            <w:proofErr w:type="spellStart"/>
-            <w:r>
-              <w:rPr>
-                <w:sz w:val="20"/>
-                <w:szCs w:val="20"/>
-              </w:rPr>
-              <w:t>contact_phone</w:t>
-            </w:r>
-            <w:proofErr w:type="spellEnd"/>
-            <w:r>
-              <w:rPr>
-                <w:sz w:val="20"/>
-                <w:szCs w:val="20"/>
-              </w:rPr>
-              <w:t>}</w:t>
-            </w:r>
-          </w:p>
-        </w:tc>
-        <w:tc>
-          <w:tcPr>
-            <w:tcW w:w="7059" w:type="dxa"/>
-          </w:tcPr>
-          <w:p>
-            <w:pPr>
-              <w:rPr>
-                <w:sz w:val="20"/>
-                <w:szCs w:val="20"/>
-              </w:rPr>
-            </w:pPr>
-            <w:r>
-              <w:rPr>
-                <w:b/>
-                <w:bCs/>
-                <w:sz w:val="20"/>
-                <w:szCs w:val="20"/>
-              </w:rPr>
-              <w:t>Date:</w:t>
-            </w:r>
-            <w:r>
-              <w:rPr>
-                <w:sz w:val="20"/>
-                <w:szCs w:val="20"/>
-              </w:rPr>
-              <w:t xml:space="preserve"> {</w:t>
-            </w:r>
-            <w:proofErr w:type="spellStart"/>
-            <w:r>
-              <w:rPr>
-                <w:sz w:val="20"/>
-                <w:szCs w:val="20"/>
-              </w:rPr>
-              <w:t>registration_date</w:t>
-            </w:r>
-            <w:proofErr w:type="spellEnd"/>
-            <w:r>
-              <w:rPr>
-                <w:sz w:val="20"/>
-                <w:szCs w:val="20"/>
-              </w:rPr>
-              <w:t xml:space="preserve">} </w:t>
-            </w:r>
-          </w:p>
-        </w:tc>
-      </w:tr>
-      <w:tr>
-        <w:trPr>
-          <w:trHeight w:val="643"/>
-        </w:trPr>
-        <w:tc>
-          <w:tcPr>
-            <w:tcW w:w="10529" w:type="dxa"/>
-            <w:gridSpan w:val="2"/>
-          </w:tcPr>
-          <w:p>
-            <w:pPr>
-              <w:rPr>
-                <w:sz w:val="20"/>
-                <w:szCs w:val="20"/>
-              </w:rPr>
-            </w:pPr>
-            <w:r>
-              <w:rPr>
-                <w:b/>
-                <w:bCs/>
                 <w:noProof/>
                 <w:sz w:val="20"/>
                 <w:szCs w:val="20"/>
@@ -1531,13 +1394,13 @@
               <mc:AlternateContent>
                 <mc:Choice Requires="wpg">
                   <w:drawing>
-                    <wp:anchor distT="0" distB="0" distL="114300" distR="114300" simplePos="0" relativeHeight="487347712" behindDoc="0" locked="0" layoutInCell="1" allowOverlap="1" wp14:anchorId="14AE2B9B" wp14:editId="26026E4E">
+                    <wp:anchor distT="0" distB="0" distL="114300" distR="114300" simplePos="0" relativeHeight="487347712" behindDoc="0" locked="0" layoutInCell="1" allowOverlap="1" wp14:anchorId="14AE2B9B" wp14:editId="6942439D">
                       <wp:simplePos x="0" y="0"/>
                       <wp:positionH relativeFrom="column">
-                        <wp:posOffset>4261485</wp:posOffset>
+                        <wp:posOffset>2072005</wp:posOffset>
                       </wp:positionH>
                       <wp:positionV relativeFrom="paragraph">
-                        <wp:posOffset>-107315</wp:posOffset>
+                        <wp:posOffset>-144780</wp:posOffset>
                       </wp:positionV>
                       <wp:extent cx="1778000" cy="546100"/>
                       <wp:effectExtent l="0" t="0" r="12700" b="12700"/>
@@ -1640,7 +1503,7 @@
                 </mc:Choice>
                 <mc:Fallback>
                   <w:pict>
-                    <v:group w14:anchorId="14AE2B9B" id="Group 30" o:spid="_x0000_s1029" style="position:absolute;margin-left:335.55pt;margin-top:-8.45pt;width:140pt;height:43pt;z-index:487347712" coordsize="17780,5461" o:gfxdata="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">
+                    <v:group w14:anchorId="14AE2B9B" id="Group 30" o:spid="_x0000_s1029" style="position:absolute;margin-left:163.15pt;margin-top:-11.4pt;width:140pt;height:43pt;z-index:487347712" coordsize="17780,5461" o:gfxdata="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">
                       <v:shape id="Text Box 28" o:spid="_x0000_s1030" type="#_x0000_t202" style="position:absolute;width:6985;height:5461;visibility:visible;mso-wrap-style:square;v-text-anchor:top" o:gfxdata="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" fillcolor="white [3201]" strokeweight=".5pt">
                         <v:textbox>
                           <w:txbxContent>
@@ -1672,6 +1535,136 @@
                 </mc:Fallback>
               </mc:AlternateContent>
             </w:r>
+            <w:r>
+              <w:rPr>
+                <w:b/>
+                <w:bCs/>
+                <w:sz w:val="20"/>
+                <w:szCs w:val="20"/>
+              </w:rPr>
+              <w:t>Commune:</w:t>
+            </w:r>
+            <w:r>
+              <w:rPr>
+                <w:sz w:val="20"/>
+                <w:szCs w:val="20"/>
+              </w:rPr>
+              <w:t xml:space="preserve"> {commune}</w:t>
+            </w:r>
+          </w:p>
+        </w:tc>
+      </w:tr>
+      <w:tr>
+        <w:trPr>
+          <w:trHeight w:val="321"/>
+        </w:trPr>
+        <w:tc>
+          <w:tcPr>
+            <w:tcW w:w="3470" w:type="dxa"/>
+          </w:tcPr>
+          <w:p>
+            <w:pPr>
+              <w:rPr>
+                <w:sz w:val="20"/>
+                <w:szCs w:val="20"/>
+              </w:rPr>
+            </w:pPr>
+            <w:r>
+              <w:rPr>
+                <w:b/>
+                <w:bCs/>
+                <w:sz w:val="20"/>
+                <w:szCs w:val="20"/>
+              </w:rPr>
+              <w:t>Mobile Number:</w:t>
+            </w:r>
+            <w:r>
+              <w:rPr>
+                <w:sz w:val="20"/>
+                <w:szCs w:val="20"/>
+              </w:rPr>
+              <w:t xml:space="preserve"> {</w:t>
+            </w:r>
+            <w:proofErr w:type="spellStart"/>
+            <w:r>
+              <w:rPr>
+                <w:sz w:val="20"/>
+                <w:szCs w:val="20"/>
+              </w:rPr>
+              <w:t>contact_phone</w:t>
+            </w:r>
+            <w:proofErr w:type="spellEnd"/>
+            <w:r>
+              <w:rPr>
+                <w:sz w:val="20"/>
+                <w:szCs w:val="20"/>
+              </w:rPr>
+              <w:t>}</w:t>
+            </w:r>
+          </w:p>
+        </w:tc>
+        <w:tc>
+          <w:tcPr>
+            <w:tcW w:w="7059" w:type="dxa"/>
+          </w:tcPr>
+          <w:p>
+            <w:pPr>
+              <w:rPr>
+                <w:sz w:val="20"/>
+                <w:szCs w:val="20"/>
+              </w:rPr>
+            </w:pPr>
+            <w:r>
+              <w:rPr>
+                <w:b/>
+                <w:bCs/>
+                <w:sz w:val="20"/>
+                <w:szCs w:val="20"/>
+              </w:rPr>
+              <w:t>Date:</w:t>
+            </w:r>
+            <w:r>
+              <w:rPr>
+                <w:sz w:val="20"/>
+                <w:szCs w:val="20"/>
+              </w:rPr>
+              <w:t xml:space="preserve"> {</w:t>
+            </w:r>
+            <w:proofErr w:type="spellStart"/>
+            <w:r>
+              <w:rPr>
+                <w:sz w:val="20"/>
+                <w:szCs w:val="20"/>
+              </w:rPr>
+              <w:t>registration_date</w:t>
+            </w:r>
+            <w:proofErr w:type="spellEnd"/>
+            <w:r>
+              <w:rPr>
+                <w:sz w:val="20"/>
+                <w:szCs w:val="20"/>
+              </w:rPr>
+              <w:t xml:space="preserve">} </w:t>
+            </w:r>
+          </w:p>
+        </w:tc>
+      </w:tr>
+      <w:tr>
+        <w:trPr>
+          <w:trHeight w:val="643"/>
+        </w:trPr>
+        <w:tc>
+          <w:tcPr>
+            <w:tcW w:w="10529" w:type="dxa"/>
+            <w:gridSpan w:val="2"/>
+          </w:tcPr>
+          <w:p>
+            <w:pPr>
+              <w:rPr>
+                <w:sz w:val="20"/>
+                <w:szCs w:val="20"/>
+              </w:rPr>
+            </w:pPr>
             <w:r>
               <w:rPr>
                 <w:b/>

</xml_diff>